<commit_message>
docs: met à jour la documentation suite à l'intégration de la vraie IA
- Cahier des charges technique : nouvelle sous-section documentant
  l'exception serverless (assistant IA via Gemini), mise à jour de la
  synthèse technique et du tableau des risques de sécurité (clé API
  désormais isolée côté serveur, plus seulement une intention).
- DEVOPS.md : nouvelle section sur la fonction serverless et la
  gestion du secret GEMINI_API_KEY, mise à jour de la sécurité
  opérationnelle et des évolutions possibles.
- Gestion_Projet_Ryan_CHAIBAT.docx : ajoute /api à la structure du
  dépôt documentée.
- Soutenance_Ryan_CHAIBAT.pptx : nuance le choix "pas de back-end"
  (données uniquement), et mentionne l'intégration réelle de l'IA sur
  les slides Choix technique, Modules IA et Déploiement continu.
</commit_message>
<xml_diff>
--- a/Document/Cahier_charges_technique_Islem_BEN_HAMIDA.docx
+++ b/Document/Cahier_charges_technique_Islem_BEN_HAMIDA.docx
@@ -349,6 +349,25 @@
           <w:rFonts w:ascii="Arial" w:cs="Arial" w:eastAsia="Arial" w:hAnsi="Arial"/>
         </w:rPr>
         <w:t xml:space="preserve">Ce choix est justifié par le délai de trois jours et par les besoins de la démonstration : il garantit la maîtrise totale des scénarios (matchs en direct, scores qui évoluent) sans dépendre d'un service externe susceptible d'être indisponible. La couche de service est volontairement isolée du reste de l'application : l'ajout ultérieur d'un back-end réel se limiterait à remplacer l'implémentation de cette couche, sans modifier l'affichage ni l'architecture.</w:t>
+      </w:r>
+    </w:p>
+    <w:p>
+      <w:pPr>
+        <w:spacing w:after="140" w:line="276"/>
+        <w:jc w:val="both"/>
+      </w:pPr>
+      <w:r>
+        <w:rPr>
+          <w:rFonts w:ascii="Arial" w:cs="Arial" w:eastAsia="Arial" w:hAnsi="Arial"/>
+          <w:b/>
+        </w:rPr>
+        <w:t xml:space="preserve">Exception ciblée : l’assistant conversationnel. </w:t>
+      </w:r>
+      <w:r>
+        <w:rPr>
+          <w:rFonts w:ascii="Arial" w:cs="Arial" w:eastAsia="Arial" w:hAnsi="Arial"/>
+        </w:rPr>
+        <w:t xml:space="preserve">Cette évolution anticipée a été mise en œuvre pour l’assistant IA : une fonction serverless (Vercel) sert de proxy vers une vraie API d’intelligence artificielle (Google Gemini). La clé d’API est stockée côté serveur (variable d’environnement) et n’est jamais exposée au client. Il s’agit du seul point d’exécution serveur du projet ; les données de matchs (classements, scores) restent entièrement fournies par la couche simulée décrite ci-dessus, et sont injectées dans le prompt envoyé à l’IA pour ancrer ses réponses dans les données réelles de l’application. En cas d’indisponibilité (clé absente, réseau coupé), un repli simulé par mots-clés prend automatiquement le relais.</w:t>
       </w:r>
     </w:p>
     <w:p>
@@ -977,7 +996,7 @@
                 <w:sz w:val="20"/>
                 <w:szCs w:val="20"/>
               </w:rPr>
-              <w:t xml:space="preserve">Non retenu (hors périmètre)</w:t>
+              <w:t xml:space="preserve">Non retenu pour les données ; fonction serverless minimale pour l’IA</w:t>
             </w:r>
           </w:p>
         </w:tc>
@@ -1010,7 +1029,7 @@
                 <w:sz w:val="20"/>
                 <w:szCs w:val="20"/>
               </w:rPr>
-              <w:t xml:space="preserve">Choix assumé et autorisé par le sujet ; couche service simulée côté client suffisante dans le délai.</w:t>
+              <w:t xml:space="preserve">Choix assumé pour les données de match ; une fonction serverless (Vercel) sert uniquement de proxy sécurisé pour l’assistant IA (clé côté serveur).</w:t>
             </w:r>
           </w:p>
         </w:tc>
@@ -1824,7 +1843,7 @@
                 <w:sz w:val="20"/>
                 <w:szCs w:val="20"/>
               </w:rPr>
-              <w:t xml:space="preserve">Aucune clé secrète dans le code client ; appels via la couche service / un back-end.</w:t>
+              <w:t xml:space="preserve">Aucune clé secrète dans le code client ; la clé de l’assistant IA est isolée dans une fonction serverless (variable d’environnement côté serveur).</w:t>
             </w:r>
           </w:p>
         </w:tc>
@@ -2493,7 +2512,7 @@
         <w:rPr>
           <w:rFonts w:ascii="Arial" w:cs="Arial" w:eastAsia="Arial" w:hAnsi="Arial"/>
         </w:rPr>
-        <w:t xml:space="preserve">Le cahier des charges technique fixe une pile sobre et cohérente (application web React, données via une API simulée, temps réel par polling) et une architecture en couches privilégiant la lisibilité, la maintenabilité et l'évolutivité. La sécurité est intégrée par des mesures de base adaptées au périmètre. Ces choix servent de cadre à la conception détaillée (UML, MERISE, maquettes) et au développement, et permettent, le cas échéant, de faire évoluer l'application vers un back-end réel sans remettre en cause son architecture.</w:t>
+        <w:t xml:space="preserve">Le cahier des charges technique fixe une pile sobre et cohérente (application web React, données via une API simulée, temps réel par polling) et une architecture en couches privilégiant la lisibilité, la maintenabilité et l’évolutivité. La sécurité est intégrée par des mesures de base adaptées au périmètre. Ces choix servent de cadre à la conception détaillée (UML, MERISE, maquettes) et au développement, et ont déjà permis de faire évoluer l’application vers un point d’exécution serveur minimal (assistant IA via fonction serverless) sans remettre en cause son architecture.</w:t>
       </w:r>
     </w:p>
     <w:sectPr>

</xml_diff>

<commit_message>
docs: precise que la phase de groupes reflète les vrais résultats CDM 2026
Met à jour le README et le cahier des charges technique pour documenter
que le contenu de la couche de données simulée correspond désormais au
vrai tirage au sort et aux vrais scores de la compétition, et non plus
à une génération aléatoire.
</commit_message>
<xml_diff>
--- a/Document/Cahier_charges_technique_Islem_BEN_HAMIDA.docx
+++ b/Document/Cahier_charges_technique_Islem_BEN_HAMIDA.docx
@@ -349,6 +349,25 @@
           <w:rFonts w:ascii="Arial" w:cs="Arial" w:eastAsia="Arial" w:hAnsi="Arial"/>
         </w:rPr>
         <w:t xml:space="preserve">Ce choix est justifié par le délai de trois jours et par les besoins de la démonstration : il garantit la maîtrise totale des scénarios (matchs en direct, scores qui évoluent) sans dépendre d'un service externe susceptible d'être indisponible. La couche de service est volontairement isolée du reste de l'application : l'ajout ultérieur d'un back-end réel se limiterait à remplacer l'implémentation de cette couche, sans modifier l'affichage ni l'architecture.</w:t>
+      </w:r>
+    </w:p>
+    <w:p>
+      <w:pPr>
+        <w:spacing w:after="140" w:line="276"/>
+        <w:jc w:val="both"/>
+      </w:pPr>
+      <w:r>
+        <w:rPr>
+          <w:rFonts w:ascii="Arial" w:cs="Arial" w:eastAsia="Arial" w:hAnsi="Arial"/>
+          <w:b/>
+        </w:rPr>
+        <w:t xml:space="preserve">Contenu des données : phase de groupes réelle. </w:t>
+      </w:r>
+      <w:r>
+        <w:rPr>
+          <w:rFonts w:ascii="Arial" w:cs="Arial" w:eastAsia="Arial" w:hAnsi="Arial"/>
+        </w:rPr>
+        <w:t xml:space="preserve">La couche simulée reste, dans son principe, une donnée figée côté client (pas d’appel réseau) : ce qui a évolué, c’est son contenu. La composition des groupes et les scores de la phase de groupes correspondent désormais au vrai tirage au sort et aux vrais résultats de la Coupe du Monde FIFA 2026, plutôt qu’à une génération aléatoire à graine. Deux rencontres des 8es de finale sont en outre injectées avec le statut « en direct » et animées par le moteur de polling, afin de conserver une démonstration du temps réel fidèle à l’actualité de la compétition ; le reste du tableau à élimination directe demeure générique (places non résolues du type « 1er du groupe A »).</w:t>
       </w:r>
     </w:p>
     <w:p>

</xml_diff>